<commit_message>
Added a changes in credit note
</commit_message>
<xml_diff>
--- a/CreditNote.docx
+++ b/CreditNote.docx
@@ -56,14 +56,14 @@
                     <w:sz w:val="32"/>
                     <w:szCs w:val="32"/>
                   </w:rPr>
-                  <w:id w:val="-727374363"/>
+                  <w:alias w:val="#Nav: /Sales_Header/CompanyName"/>
+                  <w:tag w:val="#Nav: Credit_Note/50116"/>
+                  <w:id w:val="176625627"/>
                   <w:placeholder>
                     <w:docPart w:val="DefaultPlaceholder_-1854013440"/>
                   </w:placeholder>
-                  <w:dataBinding w:prefixMappings="xmlns:ns0='urn:microsoft-dynamics-nav/reports/Credit_Note/50116/'" w:xpath="/ns0:NavWordReportXmlPart[1]/ns0:FinalCalculation[1]/ns0:CompanyName[1]" w:storeItemID="{A0661616-9F8B-46E2-88DD-A8224F94B314}"/>
+                  <w:dataBinding w:prefixMappings="xmlns:ns0='urn:microsoft-dynamics-nav/reports/Credit_Note/50116/'" w:xpath="/ns0:NavWordReportXmlPart[1]/ns0:Sales_Header[1]/ns0:CompanyName[1]" w:storeItemID="{A0661616-9F8B-46E2-88DD-A8224F94B314}"/>
                   <w:text/>
-                  <w:alias w:val="#Nav: /FinalCalculation/CompanyName"/>
-                  <w:tag w:val="#Nav: Credit_Note/50116"/>
                 </w:sdtPr>
                 <w:sdtContent>
                   <w:tc>
@@ -128,14 +128,14 @@
               </w:trPr>
               <w:sdt>
                 <w:sdtPr>
-                  <w:id w:val="-1164079075"/>
+                  <w:alias w:val="#Nav: /Sales_Header/CompanyAddress"/>
+                  <w:tag w:val="#Nav: Credit_Note/50116"/>
+                  <w:id w:val="1990138489"/>
                   <w:placeholder>
                     <w:docPart w:val="DefaultPlaceholder_-1854013440"/>
                   </w:placeholder>
-                  <w:dataBinding w:prefixMappings="xmlns:ns0='urn:microsoft-dynamics-nav/reports/Credit_Note/50116/'" w:xpath="/ns0:NavWordReportXmlPart[1]/ns0:FinalCalculation[1]/ns0:CompanyAddress[1]" w:storeItemID="{A0661616-9F8B-46E2-88DD-A8224F94B314}"/>
+                  <w:dataBinding w:prefixMappings="xmlns:ns0='urn:microsoft-dynamics-nav/reports/Credit_Note/50116/'" w:xpath="/ns0:NavWordReportXmlPart[1]/ns0:Sales_Header[1]/ns0:CompanyAddress[1]" w:storeItemID="{A0661616-9F8B-46E2-88DD-A8224F94B314}"/>
                   <w:text/>
-                  <w:alias w:val="#Nav: /FinalCalculation/CompanyAddress"/>
-                  <w:tag w:val="#Nav: Credit_Note/50116"/>
                 </w:sdtPr>
                 <w:sdtContent>
                   <w:tc>
@@ -160,11 +160,11 @@
               </w:sdt>
               <w:sdt>
                 <w:sdtPr>
-                  <w:id w:val="674307909"/>
-                  <w:dataBinding w:prefixMappings="xmlns:ns0='urn:microsoft-dynamics-nav/reports/Credit_Note/50116/'" w:xpath="/ns0:NavWordReportXmlPart[1]/ns0:FinalCalculation[1]/ns0:CompanyPicture[1]" w:storeItemID="{A0661616-9F8B-46E2-88DD-A8224F94B314}"/>
+                  <w:alias w:val="#Nav: /Sales_Header/CompanyPicture"/>
+                  <w:tag w:val="#Nav: Credit_Note/50116"/>
+                  <w:id w:val="-544445967"/>
+                  <w:dataBinding w:prefixMappings="xmlns:ns0='urn:microsoft-dynamics-nav/reports/Credit_Note/50116/'" w:xpath="/ns0:NavWordReportXmlPart[1]/ns0:Sales_Header[1]/ns0:CompanyPicture[1]" w:storeItemID="{A0661616-9F8B-46E2-88DD-A8224F94B314}"/>
                   <w:picture/>
-                  <w:alias w:val="#Nav: /FinalCalculation/CompanyPicture"/>
-                  <w:tag w:val="#Nav: Credit_Note/50116"/>
                 </w:sdtPr>
                 <w:sdtContent>
                   <w:tc>
@@ -188,10 +188,10 @@
                           <w:noProof/>
                         </w:rPr>
                         <w:drawing>
-                          <wp:inline distT="0" distB="0" distL="0" distR="0" wp14:anchorId="7878CB84" wp14:editId="21AA9362">
-                            <wp:extent cx="1874520" cy="914400"/>
-                            <wp:effectExtent l="0" t="0" r="0" b="0"/>
-                            <wp:docPr id="1" name="Picture 1"/>
+                          <wp:inline distT="0" distB="0" distL="0" distR="0" wp14:anchorId="37B10B8A" wp14:editId="4DD77CE6">
+                            <wp:extent cx="853440" cy="853440"/>
+                            <wp:effectExtent l="0" t="0" r="3810" b="3810"/>
+                            <wp:docPr id="416887325" name="Picture 1"/>
                             <wp:cNvGraphicFramePr>
                               <a:graphicFrameLocks xmlns:a="http://schemas.openxmlformats.org/drawingml/2006/main" noChangeAspect="1"/>
                             </wp:cNvGraphicFramePr>
@@ -199,7 +199,7 @@
                               <a:graphicData uri="http://schemas.openxmlformats.org/drawingml/2006/picture">
                                 <pic:pic xmlns:pic="http://schemas.openxmlformats.org/drawingml/2006/picture">
                                   <pic:nvPicPr>
-                                    <pic:cNvPr id="1" name="Picture 1"/>
+                                    <pic:cNvPr id="416887325" name="Picture 1"/>
                                     <pic:cNvPicPr>
                                       <a:picLocks noChangeAspect="1" noChangeArrowheads="1"/>
                                     </pic:cNvPicPr>
@@ -213,7 +213,7 @@
                                   <pic:spPr bwMode="auto">
                                     <a:xfrm>
                                       <a:off x="0" y="0"/>
-                                      <a:ext cx="1874520" cy="914400"/>
+                                      <a:ext cx="853440" cy="853440"/>
                                     </a:xfrm>
                                     <a:prstGeom prst="rect">
                                       <a:avLst/>
@@ -251,14 +251,14 @@
                 <w:p>
                   <w:sdt>
                     <w:sdtPr>
-                      <w:id w:val="1863774438"/>
+                      <w:alias w:val="#Nav: /Sales_Header/CompanyCity"/>
+                      <w:tag w:val="#Nav: Credit_Note/50116"/>
+                      <w:id w:val="-110278558"/>
                       <w:placeholder>
                         <w:docPart w:val="DefaultPlaceholder_-1854013440"/>
                       </w:placeholder>
-                      <w:dataBinding w:prefixMappings="xmlns:ns0='urn:microsoft-dynamics-nav/reports/Credit_Note/50116/'" w:xpath="/ns0:NavWordReportXmlPart[1]/ns0:FinalCalculation[1]/ns0:CompanyCity[1]" w:storeItemID="{A0661616-9F8B-46E2-88DD-A8224F94B314}"/>
+                      <w:dataBinding w:prefixMappings="xmlns:ns0='urn:microsoft-dynamics-nav/reports/Credit_Note/50116/'" w:xpath="/ns0:NavWordReportXmlPart[1]/ns0:Sales_Header[1]/ns0:CompanyCity[1]" w:storeItemID="{A0661616-9F8B-46E2-88DD-A8224F94B314}"/>
                       <w:text/>
-                      <w:alias w:val="#Nav: /FinalCalculation/CompanyCity"/>
-                      <w:tag w:val="#Nav: Credit_Note/50116"/>
                     </w:sdtPr>
                     <w:sdtContent>
                       <w:proofErr w:type="spellStart"/>
@@ -276,14 +276,14 @@
                   </w:r>
                   <w:sdt>
                     <w:sdtPr>
-                      <w:id w:val="1303808135"/>
+                      <w:alias w:val="#Nav: /Sales_Header/CompanyPostcode"/>
+                      <w:tag w:val="#Nav: Credit_Note/50116"/>
+                      <w:id w:val="-1188372888"/>
                       <w:placeholder>
                         <w:docPart w:val="DefaultPlaceholder_-1854013440"/>
                       </w:placeholder>
-                      <w:dataBinding w:prefixMappings="xmlns:ns0='urn:microsoft-dynamics-nav/reports/Credit_Note/50116/'" w:xpath="/ns0:NavWordReportXmlPart[1]/ns0:FinalCalculation[1]/ns0:CompanyPostcode[1]" w:storeItemID="{A0661616-9F8B-46E2-88DD-A8224F94B314}"/>
+                      <w:dataBinding w:prefixMappings="xmlns:ns0='urn:microsoft-dynamics-nav/reports/Credit_Note/50116/'" w:xpath="/ns0:NavWordReportXmlPart[1]/ns0:Sales_Header[1]/ns0:CompanyPostcode[1]" w:storeItemID="{A0661616-9F8B-46E2-88DD-A8224F94B314}"/>
                       <w:text/>
-                      <w:alias w:val="#Nav: /FinalCalculation/CompanyPostcode"/>
-                      <w:tag w:val="#Nav: Credit_Note/50116"/>
                     </w:sdtPr>
                     <w:sdtContent>
                       <w:proofErr w:type="spellStart"/>
@@ -301,14 +301,14 @@
                   </w:r>
                   <w:sdt>
                     <w:sdtPr>
-                      <w:id w:val="-357969111"/>
+                      <w:alias w:val="#Nav: /Sales_Header/CompanyCountry"/>
+                      <w:tag w:val="#Nav: Credit_Note/50116"/>
+                      <w:id w:val="-318273545"/>
                       <w:placeholder>
                         <w:docPart w:val="DefaultPlaceholder_-1854013440"/>
                       </w:placeholder>
-                      <w:dataBinding w:prefixMappings="xmlns:ns0='urn:microsoft-dynamics-nav/reports/Credit_Note/50116/'" w:xpath="/ns0:NavWordReportXmlPart[1]/ns0:FinalCalculation[1]/ns0:CompanyCountry[1]" w:storeItemID="{A0661616-9F8B-46E2-88DD-A8224F94B314}"/>
+                      <w:dataBinding w:prefixMappings="xmlns:ns0='urn:microsoft-dynamics-nav/reports/Credit_Note/50116/'" w:xpath="/ns0:NavWordReportXmlPart[1]/ns0:Sales_Header[1]/ns0:CompanyCountry[1]" w:storeItemID="{A0661616-9F8B-46E2-88DD-A8224F94B314}"/>
                       <w:text/>
-                      <w:alias w:val="#Nav: /FinalCalculation/CompanyCountry"/>
-                      <w:tag w:val="#Nav: Credit_Note/50116"/>
                     </w:sdtPr>
                     <w:sdtContent>
                       <w:proofErr w:type="spellStart"/>
@@ -355,14 +355,14 @@
                   </w:r>
                   <w:sdt>
                     <w:sdtPr>
-                      <w:id w:val="-374078453"/>
+                      <w:alias w:val="#Nav: /Sales_Header/CompanyPhone"/>
+                      <w:tag w:val="#Nav: Credit_Note/50116"/>
+                      <w:id w:val="304974334"/>
                       <w:placeholder>
                         <w:docPart w:val="DefaultPlaceholder_-1854013440"/>
                       </w:placeholder>
-                      <w:dataBinding w:prefixMappings="xmlns:ns0='urn:microsoft-dynamics-nav/reports/Credit_Note/50116/'" w:xpath="/ns0:NavWordReportXmlPart[1]/ns0:FinalCalculation[1]/ns0:CompanyPhone[1]" w:storeItemID="{A0661616-9F8B-46E2-88DD-A8224F94B314}"/>
+                      <w:dataBinding w:prefixMappings="xmlns:ns0='urn:microsoft-dynamics-nav/reports/Credit_Note/50116/'" w:xpath="/ns0:NavWordReportXmlPart[1]/ns0:Sales_Header[1]/ns0:CompanyPhone[1]" w:storeItemID="{A0661616-9F8B-46E2-88DD-A8224F94B314}"/>
                       <w:text/>
-                      <w:alias w:val="#Nav: /FinalCalculation/CompanyPhone"/>
-                      <w:tag w:val="#Nav: Credit_Note/50116"/>
                     </w:sdtPr>
                     <w:sdtContent>
                       <w:proofErr w:type="spellStart"/>
@@ -409,14 +409,14 @@
                   </w:r>
                   <w:sdt>
                     <w:sdtPr>
-                      <w:id w:val="638308014"/>
+                      <w:alias w:val="#Nav: /Sales_Header/CompanyEmail"/>
+                      <w:tag w:val="#Nav: Credit_Note/50116"/>
+                      <w:id w:val="-2139552942"/>
                       <w:placeholder>
                         <w:docPart w:val="DefaultPlaceholder_-1854013440"/>
                       </w:placeholder>
-                      <w:dataBinding w:prefixMappings="xmlns:ns0='urn:microsoft-dynamics-nav/reports/Credit_Note/50116/'" w:xpath="/ns0:NavWordReportXmlPart[1]/ns0:FinalCalculation[1]/ns0:CompanyEmail[1]" w:storeItemID="{A0661616-9F8B-46E2-88DD-A8224F94B314}"/>
+                      <w:dataBinding w:prefixMappings="xmlns:ns0='urn:microsoft-dynamics-nav/reports/Credit_Note/50116/'" w:xpath="/ns0:NavWordReportXmlPart[1]/ns0:Sales_Header[1]/ns0:CompanyEmail[1]" w:storeItemID="{A0661616-9F8B-46E2-88DD-A8224F94B314}"/>
                       <w:text/>
-                      <w:alias w:val="#Nav: /FinalCalculation/CompanyEmail"/>
-                      <w:tag w:val="#Nav: Credit_Note/50116"/>
                     </w:sdtPr>
                     <w:sdtContent>
                       <w:proofErr w:type="spellStart"/>
@@ -463,14 +463,14 @@
                   </w:r>
                   <w:sdt>
                     <w:sdtPr>
-                      <w:id w:val="1369113112"/>
+                      <w:alias w:val="#Nav: /Sales_Header/CompanyTRN"/>
+                      <w:tag w:val="#Nav: Credit_Note/50116"/>
+                      <w:id w:val="-663153500"/>
                       <w:placeholder>
                         <w:docPart w:val="DefaultPlaceholder_-1854013440"/>
                       </w:placeholder>
-                      <w:dataBinding w:prefixMappings="xmlns:ns0='urn:microsoft-dynamics-nav/reports/Credit_Note/50116/'" w:xpath="/ns0:NavWordReportXmlPart[1]/ns0:FinalCalculation[1]/ns0:CompanyTRN[1]" w:storeItemID="{A0661616-9F8B-46E2-88DD-A8224F94B314}"/>
+                      <w:dataBinding w:prefixMappings="xmlns:ns0='urn:microsoft-dynamics-nav/reports/Credit_Note/50116/'" w:xpath="/ns0:NavWordReportXmlPart[1]/ns0:Sales_Header[1]/ns0:CompanyTRN[1]" w:storeItemID="{A0661616-9F8B-46E2-88DD-A8224F94B314}"/>
                       <w:text/>
-                      <w:alias w:val="#Nav: /FinalCalculation/CompanyTRN"/>
-                      <w:tag w:val="#Nav: Credit_Note/50116"/>
                     </w:sdtPr>
                     <w:sdtContent>
                       <w:proofErr w:type="spellStart"/>
@@ -526,8 +526,25 @@
                 </w:tcPr>
                 <w:p>
                   <w:r>
-                    <w:t>Credit Note No: 1</w:t>
-                  </w:r>
+                    <w:t xml:space="preserve">Credit Note No: </w:t>
+                  </w:r>
+                  <w:sdt>
+                    <w:sdtPr>
+                      <w:alias w:val="#Nav: /Sales_Header/No_"/>
+                      <w:tag w:val="#Nav: Credit_Note/50116"/>
+                      <w:id w:val="1619489179"/>
+                      <w:placeholder>
+                        <w:docPart w:val="DefaultPlaceholder_-1854013440"/>
+                      </w:placeholder>
+                      <w:dataBinding w:prefixMappings="xmlns:ns0='urn:microsoft-dynamics-nav/reports/Credit_Note/50116/'" w:xpath="/ns0:NavWordReportXmlPart[1]/ns0:Sales_Header[1]/ns0:No_[1]" w:storeItemID="{A0661616-9F8B-46E2-88DD-A8224F94B314}"/>
+                      <w:text/>
+                    </w:sdtPr>
+                    <w:sdtContent>
+                      <w:r>
+                        <w:t>No_</w:t>
+                      </w:r>
+                    </w:sdtContent>
+                  </w:sdt>
                 </w:p>
               </w:tc>
               <w:tc>
@@ -542,6 +559,28 @@
                   <w:r>
                     <w:t xml:space="preserve">Original Invoice No: </w:t>
                   </w:r>
+                  <w:sdt>
+                    <w:sdtPr>
+                      <w:alias w:val="#Nav: /Sales_Header/Applies_to_Doc__No_"/>
+                      <w:tag w:val="#Nav: Credit_Note/50116"/>
+                      <w:id w:val="-1493408085"/>
+                      <w:placeholder>
+                        <w:docPart w:val="DefaultPlaceholder_-1854013440"/>
+                      </w:placeholder>
+                      <w:dataBinding w:prefixMappings="xmlns:ns0='urn:microsoft-dynamics-nav/reports/Credit_Note/50116/'" w:xpath="/ns0:NavWordReportXmlPart[1]/ns0:Sales_Header[1]/ns0:Applies_to_Doc__No_[1]" w:storeItemID="{A0661616-9F8B-46E2-88DD-A8224F94B314}"/>
+                      <w:text/>
+                    </w:sdtPr>
+                    <w:sdtContent>
+                      <w:proofErr w:type="spellStart"/>
+                      <w:r>
+                        <w:t>Applies_to_Doc__No</w:t>
+                      </w:r>
+                      <w:proofErr w:type="spellEnd"/>
+                      <w:r>
+                        <w:t>_</w:t>
+                      </w:r>
+                    </w:sdtContent>
+                  </w:sdt>
                 </w:p>
               </w:tc>
             </w:tr>
@@ -569,13 +608,13 @@
                   </w:r>
                   <w:sdt>
                     <w:sdtPr>
-                      <w:alias w:val="#Nav: /Payment_Mode2/CurrentDate"/>
+                      <w:alias w:val="#Nav: /Sales_Header/CurrentDate"/>
                       <w:tag w:val="#Nav: Credit_Note/50116"/>
-                      <w:id w:val="-1709092755"/>
+                      <w:id w:val="-1416856092"/>
                       <w:placeholder>
-                        <w:docPart w:val="6B47D3385FDA4A198E5FFC69BD6B40B6"/>
+                        <w:docPart w:val="DefaultPlaceholder_-1854013440"/>
                       </w:placeholder>
-                      <w:dataBinding w:prefixMappings="xmlns:ns0='urn:microsoft-dynamics-nav/reports/Credit_Note/50116/'" w:xpath="/ns0:NavWordReportXmlPart[1]/ns0:Payment_Mode2[1]/ns0:CurrentDate[1]" w:storeItemID="{072A5C88-FD1B-4274-ACD9-2C46D19524E4}"/>
+                      <w:dataBinding w:prefixMappings="xmlns:ns0='urn:microsoft-dynamics-nav/reports/Credit_Note/50116/'" w:xpath="/ns0:NavWordReportXmlPart[1]/ns0:Sales_Header[1]/ns0:CurrentDate[1]" w:storeItemID="{A0661616-9F8B-46E2-88DD-A8224F94B314}"/>
                       <w:text/>
                     </w:sdtPr>
                     <w:sdtContent>
@@ -665,13 +704,13 @@
               </w:trPr>
               <w:sdt>
                 <w:sdtPr>
-                  <w:alias w:val="#Nav: /Payment_Mode2/Tenant_Name"/>
+                  <w:alias w:val="#Nav: /Sales_Header/Customer/Name"/>
                   <w:tag w:val="#Nav: Credit_Note/50116"/>
-                  <w:id w:val="1773817425"/>
+                  <w:id w:val="1671679161"/>
                   <w:placeholder>
-                    <w:docPart w:val="3D84BFD8BD3E40DB9132ABE470E39955"/>
+                    <w:docPart w:val="DefaultPlaceholder_-1854013440"/>
                   </w:placeholder>
-                  <w:dataBinding w:prefixMappings="xmlns:ns0='urn:microsoft-dynamics-nav/reports/Credit_Note/50116/'" w:xpath="/ns0:NavWordReportXmlPart[1]/ns0:Payment_Mode2[1]/ns0:Tenant_Name[1]" w:storeItemID="{072A5C88-FD1B-4274-ACD9-2C46D19524E4}"/>
+                  <w:dataBinding w:prefixMappings="xmlns:ns0='urn:microsoft-dynamics-nav/reports/Credit_Note/50116/'" w:xpath="/ns0:NavWordReportXmlPart[1]/ns0:Sales_Header[1]/ns0:Customer[1]/ns0:Name[1]" w:storeItemID="{A0661616-9F8B-46E2-88DD-A8224F94B314}"/>
                   <w:text/>
                 </w:sdtPr>
                 <w:sdtContent>
@@ -684,11 +723,9 @@
                       </w:tcBorders>
                     </w:tcPr>
                     <w:p>
-                      <w:proofErr w:type="spellStart"/>
                       <w:r>
-                        <w:t>Tenant_Name</w:t>
+                        <w:t>Name</w:t>
                       </w:r>
-                      <w:proofErr w:type="spellEnd"/>
                     </w:p>
                   </w:tc>
                 </w:sdtContent>
@@ -707,13 +744,13 @@
                   </w:r>
                   <w:sdt>
                     <w:sdtPr>
-                      <w:alias w:val="#Nav: /Payment_Mode2/Contract_ID"/>
+                      <w:alias w:val="#Nav: /Sales_Header/Contract_ID"/>
                       <w:tag w:val="#Nav: Credit_Note/50116"/>
-                      <w:id w:val="-1811244751"/>
+                      <w:id w:val="-674102042"/>
                       <w:placeholder>
-                        <w:docPart w:val="3D84BFD8BD3E40DB9132ABE470E39955"/>
+                        <w:docPart w:val="DefaultPlaceholder_-1854013440"/>
                       </w:placeholder>
-                      <w:dataBinding w:prefixMappings="xmlns:ns0='urn:microsoft-dynamics-nav/reports/Credit_Note/50116/'" w:xpath="/ns0:NavWordReportXmlPart[1]/ns0:Payment_Mode2[1]/ns0:Contract_ID[1]" w:storeItemID="{072A5C88-FD1B-4274-ACD9-2C46D19524E4}"/>
+                      <w:dataBinding w:prefixMappings="xmlns:ns0='urn:microsoft-dynamics-nav/reports/Credit_Note/50116/'" w:xpath="/ns0:NavWordReportXmlPart[1]/ns0:Sales_Header[1]/ns0:Contract_ID[1]" w:storeItemID="{A0661616-9F8B-46E2-88DD-A8224F94B314}"/>
                       <w:text/>
                     </w:sdtPr>
                     <w:sdtContent>
@@ -733,13 +770,13 @@
               </w:trPr>
               <w:sdt>
                 <w:sdtPr>
-                  <w:alias w:val="#Nav: /Payment_Mode2/Customer/Address"/>
+                  <w:alias w:val="#Nav: /Sales_Header/Customer/Address"/>
                   <w:tag w:val="#Nav: Credit_Note/50116"/>
-                  <w:id w:val="-552774509"/>
+                  <w:id w:val="633450553"/>
                   <w:placeholder>
-                    <w:docPart w:val="3D84BFD8BD3E40DB9132ABE470E39955"/>
+                    <w:docPart w:val="DefaultPlaceholder_-1854013440"/>
                   </w:placeholder>
-                  <w:dataBinding w:prefixMappings="xmlns:ns0='urn:microsoft-dynamics-nav/reports/Credit_Note/50116/'" w:xpath="/ns0:NavWordReportXmlPart[1]/ns0:Payment_Mode2[1]/ns0:Customer[1]/ns0:Address[1]" w:storeItemID="{072A5C88-FD1B-4274-ACD9-2C46D19524E4}"/>
+                  <w:dataBinding w:prefixMappings="xmlns:ns0='urn:microsoft-dynamics-nav/reports/Credit_Note/50116/'" w:xpath="/ns0:NavWordReportXmlPart[1]/ns0:Sales_Header[1]/ns0:Customer[1]/ns0:Address[1]" w:storeItemID="{A0661616-9F8B-46E2-88DD-A8224F94B314}"/>
                   <w:text/>
                 </w:sdtPr>
                 <w:sdtContent>
@@ -775,13 +812,13 @@
                   </w:r>
                   <w:sdt>
                     <w:sdtPr>
-                      <w:alias w:val="#Nav: /Payment_Mode2/Tenancy_Contract/Property_Name"/>
+                      <w:alias w:val="#Nav: /Sales_Header/Tenancy_Contract/Property_Name"/>
                       <w:tag w:val="#Nav: Credit_Note/50116"/>
-                      <w:id w:val="-318037813"/>
+                      <w:id w:val="1889299124"/>
                       <w:placeholder>
-                        <w:docPart w:val="3D84BFD8BD3E40DB9132ABE470E39955"/>
+                        <w:docPart w:val="DefaultPlaceholder_-1854013440"/>
                       </w:placeholder>
-                      <w:dataBinding w:prefixMappings="xmlns:ns0='urn:microsoft-dynamics-nav/reports/Credit_Note/50116/'" w:xpath="/ns0:NavWordReportXmlPart[1]/ns0:Payment_Mode2[1]/ns0:Tenancy_Contract[1]/ns0:Property_Name[1]" w:storeItemID="{072A5C88-FD1B-4274-ACD9-2C46D19524E4}"/>
+                      <w:dataBinding w:prefixMappings="xmlns:ns0='urn:microsoft-dynamics-nav/reports/Credit_Note/50116/'" w:xpath="/ns0:NavWordReportXmlPart[1]/ns0:Sales_Header[1]/ns0:Tenancy_Contract[1]/ns0:Property_Name[1]" w:storeItemID="{A0661616-9F8B-46E2-88DD-A8224F94B314}"/>
                       <w:text/>
                     </w:sdtPr>
                     <w:sdtContent>
@@ -814,13 +851,13 @@
                   </w:r>
                   <w:sdt>
                     <w:sdtPr>
-                      <w:alias w:val="#Nav: /Payment_Mode2/Customer/Phone_No_"/>
+                      <w:alias w:val="#Nav: /Sales_Header/Customer/Phone_No_"/>
                       <w:tag w:val="#Nav: Credit_Note/50116"/>
-                      <w:id w:val="130597214"/>
+                      <w:id w:val="1404483334"/>
                       <w:placeholder>
-                        <w:docPart w:val="3D84BFD8BD3E40DB9132ABE470E39955"/>
+                        <w:docPart w:val="DefaultPlaceholder_-1854013440"/>
                       </w:placeholder>
-                      <w:dataBinding w:prefixMappings="xmlns:ns0='urn:microsoft-dynamics-nav/reports/Credit_Note/50116/'" w:xpath="/ns0:NavWordReportXmlPart[1]/ns0:Payment_Mode2[1]/ns0:Customer[1]/ns0:Phone_No_[1]" w:storeItemID="{072A5C88-FD1B-4274-ACD9-2C46D19524E4}"/>
+                      <w:dataBinding w:prefixMappings="xmlns:ns0='urn:microsoft-dynamics-nav/reports/Credit_Note/50116/'" w:xpath="/ns0:NavWordReportXmlPart[1]/ns0:Sales_Header[1]/ns0:Customer[1]/ns0:Phone_No_[1]" w:storeItemID="{A0661616-9F8B-46E2-88DD-A8224F94B314}"/>
                       <w:text/>
                     </w:sdtPr>
                     <w:sdtContent>
@@ -851,19 +888,19 @@
                   </w:r>
                   <w:sdt>
                     <w:sdtPr>
-                      <w:alias w:val="#Nav: /Payment_Mode2/Tenancy_Contract/Unit_Name"/>
+                      <w:alias w:val="#Nav: /Sales_Header/Tenancy_Contract/unit_Name"/>
                       <w:tag w:val="#Nav: Credit_Note/50116"/>
-                      <w:id w:val="-721284586"/>
+                      <w:id w:val="-410156764"/>
                       <w:placeholder>
-                        <w:docPart w:val="3D84BFD8BD3E40DB9132ABE470E39955"/>
+                        <w:docPart w:val="DefaultPlaceholder_-1854013440"/>
                       </w:placeholder>
-                      <w:dataBinding w:prefixMappings="xmlns:ns0='urn:microsoft-dynamics-nav/reports/Credit_Note/50116/'" w:xpath="/ns0:NavWordReportXmlPart[1]/ns0:Payment_Mode2[1]/ns0:Tenancy_Contract[1]/ns0:Unit_Name[1]" w:storeItemID="{072A5C88-FD1B-4274-ACD9-2C46D19524E4}"/>
+                      <w:dataBinding w:prefixMappings="xmlns:ns0='urn:microsoft-dynamics-nav/reports/Credit_Note/50116/'" w:xpath="/ns0:NavWordReportXmlPart[1]/ns0:Sales_Header[1]/ns0:Tenancy_Contract[1]/ns0:unit_Name[1]" w:storeItemID="{A0661616-9F8B-46E2-88DD-A8224F94B314}"/>
                       <w:text/>
                     </w:sdtPr>
                     <w:sdtContent>
                       <w:proofErr w:type="spellStart"/>
                       <w:r>
-                        <w:t>Unit_Name</w:t>
+                        <w:t>unit_Name</w:t>
                       </w:r>
                       <w:proofErr w:type="spellEnd"/>
                     </w:sdtContent>
@@ -890,19 +927,19 @@
                   </w:r>
                   <w:sdt>
                     <w:sdtPr>
-                      <w:alias w:val="#Nav: /Payment_Mode2/Tenant_Email"/>
+                      <w:alias w:val="#Nav: /Sales_Header/Customer/E_Mail"/>
                       <w:tag w:val="#Nav: Credit_Note/50116"/>
-                      <w:id w:val="-1683736546"/>
+                      <w:id w:val="-1218039665"/>
                       <w:placeholder>
-                        <w:docPart w:val="3D84BFD8BD3E40DB9132ABE470E39955"/>
+                        <w:docPart w:val="DefaultPlaceholder_-1854013440"/>
                       </w:placeholder>
-                      <w:dataBinding w:prefixMappings="xmlns:ns0='urn:microsoft-dynamics-nav/reports/Credit_Note/50116/'" w:xpath="/ns0:NavWordReportXmlPart[1]/ns0:Payment_Mode2[1]/ns0:Tenant_Email[1]" w:storeItemID="{072A5C88-FD1B-4274-ACD9-2C46D19524E4}"/>
+                      <w:dataBinding w:prefixMappings="xmlns:ns0='urn:microsoft-dynamics-nav/reports/Credit_Note/50116/'" w:xpath="/ns0:NavWordReportXmlPart[1]/ns0:Sales_Header[1]/ns0:Customer[1]/ns0:E_Mail[1]" w:storeItemID="{A0661616-9F8B-46E2-88DD-A8224F94B314}"/>
                       <w:text/>
                     </w:sdtPr>
                     <w:sdtContent>
                       <w:proofErr w:type="spellStart"/>
                       <w:r>
-                        <w:t>Tenant_Email</w:t>
+                        <w:t>E_Mail</w:t>
                       </w:r>
                       <w:proofErr w:type="spellEnd"/>
                     </w:sdtContent>
@@ -914,13 +951,13 @@
                   </w:r>
                   <w:sdt>
                     <w:sdtPr>
-                      <w:alias w:val="#Nav: /Payment_Mode2/Customer/Cus_TRN"/>
+                      <w:alias w:val="#Nav: /Sales_Header/Customer/Cus_TRN"/>
                       <w:tag w:val="#Nav: Credit_Note/50116"/>
-                      <w:id w:val="2008099593"/>
+                      <w:id w:val="-6287033"/>
                       <w:placeholder>
-                        <w:docPart w:val="4467748C899B427480A217B9D9897F67"/>
+                        <w:docPart w:val="DefaultPlaceholder_-1854013440"/>
                       </w:placeholder>
-                      <w:dataBinding w:prefixMappings="xmlns:ns0='urn:microsoft-dynamics-nav/reports/Credit_Note/50116/'" w:xpath="/ns0:NavWordReportXmlPart[1]/ns0:Payment_Mode2[1]/ns0:Customer[1]/ns0:Cus_TRN[1]" w:storeItemID="{072A5C88-FD1B-4274-ACD9-2C46D19524E4}"/>
+                      <w:dataBinding w:prefixMappings="xmlns:ns0='urn:microsoft-dynamics-nav/reports/Credit_Note/50116/'" w:xpath="/ns0:NavWordReportXmlPart[1]/ns0:Sales_Header[1]/ns0:Customer[1]/ns0:Cus_TRN[1]" w:storeItemID="{A0661616-9F8B-46E2-88DD-A8224F94B314}"/>
                       <w:text/>
                     </w:sdtPr>
                     <w:sdtContent>
@@ -944,17 +981,45 @@
                 </w:tcPr>
                 <w:p>
                   <w:r>
-                    <w:t xml:space="preserve">Contract Period: To </w:t>
+                    <w:t xml:space="preserve">Contract Period: </w:t>
                   </w:r>
                   <w:sdt>
                     <w:sdtPr>
-                      <w:alias w:val="#Nav: /Payment_Mode2/Tenancy_Contract/Contract_End_Date"/>
+                      <w:alias w:val="#Nav: /Sales_Header/Tenancy_Contract/Contract_Start_Date"/>
                       <w:tag w:val="#Nav: Credit_Note/50116"/>
-                      <w:id w:val="1667978131"/>
+                      <w:id w:val="2061893472"/>
                       <w:placeholder>
-                        <w:docPart w:val="3D84BFD8BD3E40DB9132ABE470E39955"/>
+                        <w:docPart w:val="DefaultPlaceholder_-1854013440"/>
                       </w:placeholder>
-                      <w:dataBinding w:prefixMappings="xmlns:ns0='urn:microsoft-dynamics-nav/reports/Credit_Note/50116/'" w:xpath="/ns0:NavWordReportXmlPart[1]/ns0:Payment_Mode2[1]/ns0:Tenancy_Contract[1]/ns0:Contract_End_Date[1]" w:storeItemID="{072A5C88-FD1B-4274-ACD9-2C46D19524E4}"/>
+                      <w:dataBinding w:prefixMappings="xmlns:ns0='urn:microsoft-dynamics-nav/reports/Credit_Note/50116/'" w:xpath="/ns0:NavWordReportXmlPart[1]/ns0:Sales_Header[1]/ns0:Tenancy_Contract[1]/ns0:Contract_Start_Date[1]" w:storeItemID="{A0661616-9F8B-46E2-88DD-A8224F94B314}"/>
+                      <w:text/>
+                    </w:sdtPr>
+                    <w:sdtContent>
+                      <w:proofErr w:type="spellStart"/>
+                      <w:r>
+                        <w:t>Contract_Start_Date</w:t>
+                      </w:r>
+                      <w:proofErr w:type="spellEnd"/>
+                    </w:sdtContent>
+                  </w:sdt>
+                  <w:r>
+                    <w:t xml:space="preserve"> </w:t>
+                  </w:r>
+                  <w:r>
+                    <w:t>To</w:t>
+                  </w:r>
+                  <w:r>
+                    <w:t xml:space="preserve"> </w:t>
+                  </w:r>
+                  <w:sdt>
+                    <w:sdtPr>
+                      <w:alias w:val="#Nav: /Sales_Header/Tenancy_Contract/Contract_End_Date"/>
+                      <w:tag w:val="#Nav: Credit_Note/50116"/>
+                      <w:id w:val="-967976806"/>
+                      <w:placeholder>
+                        <w:docPart w:val="DefaultPlaceholder_-1854013440"/>
+                      </w:placeholder>
+                      <w:dataBinding w:prefixMappings="xmlns:ns0='urn:microsoft-dynamics-nav/reports/Credit_Note/50116/'" w:xpath="/ns0:NavWordReportXmlPart[1]/ns0:Sales_Header[1]/ns0:Tenancy_Contract[1]/ns0:Contract_End_Date[1]" w:storeItemID="{A0661616-9F8B-46E2-88DD-A8224F94B314}"/>
                       <w:text/>
                     </w:sdtPr>
                     <w:sdtContent>
@@ -965,6 +1030,9 @@
                       <w:proofErr w:type="spellEnd"/>
                     </w:sdtContent>
                   </w:sdt>
+                  <w:r>
+                    <w:t xml:space="preserve"> </w:t>
+                  </w:r>
                 </w:p>
                 <w:p>
                   <w:r>
@@ -972,13 +1040,13 @@
                   </w:r>
                   <w:sdt>
                     <w:sdtPr>
-                      <w:alias w:val="#Nav: /Payment_Mode2/Tenancy_Contract/Contract_Tenor"/>
+                      <w:alias w:val="#Nav: /Sales_Header/Tenancy_Contract/Contract_Tenor"/>
                       <w:tag w:val="#Nav: Credit_Note/50116"/>
-                      <w:id w:val="1482349267"/>
+                      <w:id w:val="1023442008"/>
                       <w:placeholder>
-                        <w:docPart w:val="C75BEA1B10224BD0BF7231C0EBD4A45B"/>
+                        <w:docPart w:val="DefaultPlaceholder_-1854013440"/>
                       </w:placeholder>
-                      <w:dataBinding w:prefixMappings="xmlns:ns0='urn:microsoft-dynamics-nav/reports/Credit_Note/50116/'" w:xpath="/ns0:NavWordReportXmlPart[1]/ns0:Payment_Mode2[1]/ns0:Tenancy_Contract[1]/ns0:Contract_Tenor[1]" w:storeItemID="{072A5C88-FD1B-4274-ACD9-2C46D19524E4}"/>
+                      <w:dataBinding w:prefixMappings="xmlns:ns0='urn:microsoft-dynamics-nav/reports/Credit_Note/50116/'" w:xpath="/ns0:NavWordReportXmlPart[1]/ns0:Sales_Header[1]/ns0:Tenancy_Contract[1]/ns0:Contract_Tenor[1]" w:storeItemID="{A0661616-9F8B-46E2-88DD-A8224F94B314}"/>
                       <w:text/>
                     </w:sdtPr>
                     <w:sdtContent>
@@ -1143,6 +1211,229 @@
                 </w:p>
               </w:tc>
             </w:tr>
+            <w:sdt>
+              <w:sdtPr>
+                <w:alias w:val="#Nav: /Sales_Header/Sales_Line"/>
+                <w:tag w:val="#Nav: Credit_Note/50116"/>
+                <w:id w:val="-392739253"/>
+                <w15:dataBinding w:prefixMappings="xmlns:ns0='urn:microsoft-dynamics-nav/reports/Credit_Note/50116/'" w:xpath="/ns0:NavWordReportXmlPart[1]/ns0:Sales_Header[1]/ns0:Sales_Line" w:storeItemID="{A0661616-9F8B-46E2-88DD-A8224F94B314}"/>
+                <w15:repeatingSection/>
+              </w:sdtPr>
+              <w:sdtContent>
+                <w:sdt>
+                  <w:sdtPr>
+                    <w:id w:val="313915844"/>
+                    <w:placeholder>
+                      <w:docPart w:val="DefaultPlaceholder_-1854013435"/>
+                    </w:placeholder>
+                    <w15:repeatingSectionItem/>
+                  </w:sdtPr>
+                  <w:sdtContent>
+                    <w:tr>
+                      <w:trPr>
+                        <w:trHeight w:val="244"/>
+                      </w:trPr>
+                      <w:sdt>
+                        <w:sdtPr>
+                          <w:alias w:val="#Nav: /Sales_Header/Sales_Line/Serial_No"/>
+                          <w:tag w:val="#Nav: Credit_Note/50116"/>
+                          <w:id w:val="1764097189"/>
+                          <w:placeholder>
+                            <w:docPart w:val="DefaultPlaceholder_-1854013440"/>
+                          </w:placeholder>
+                          <w:dataBinding w:prefixMappings="xmlns:ns0='urn:microsoft-dynamics-nav/reports/Credit_Note/50116/'" w:xpath="/ns0:NavWordReportXmlPart[1]/ns0:Sales_Header[1]/ns0:Sales_Line[1]/ns0:Serial_No[1]" w:storeItemID="{A0661616-9F8B-46E2-88DD-A8224F94B314}"/>
+                          <w:text/>
+                        </w:sdtPr>
+                        <w:sdtContent>
+                          <w:tc>
+                            <w:tcPr>
+                              <w:tcW w:w="1332" w:type="dxa"/>
+                              <w:shd w:val="clear" w:color="auto" w:fill="FFFFFF" w:themeFill="background1"/>
+                            </w:tcPr>
+                            <w:p>
+                              <w:pPr>
+                                <w:rPr>
+                                  <w:b/>
+                                  <w:bCs/>
+                                </w:rPr>
+                              </w:pPr>
+                              <w:proofErr w:type="spellStart"/>
+                              <w:r>
+                                <w:t>Serial_No</w:t>
+                              </w:r>
+                              <w:proofErr w:type="spellEnd"/>
+                            </w:p>
+                          </w:tc>
+                        </w:sdtContent>
+                      </w:sdt>
+                      <w:sdt>
+                        <w:sdtPr>
+                          <w:alias w:val="#Nav: /Sales_Header/Sales_Line/Description"/>
+                          <w:tag w:val="#Nav: Credit_Note/50116"/>
+                          <w:id w:val="1544323657"/>
+                          <w:placeholder>
+                            <w:docPart w:val="DefaultPlaceholder_-1854013440"/>
+                          </w:placeholder>
+                          <w:dataBinding w:prefixMappings="xmlns:ns0='urn:microsoft-dynamics-nav/reports/Credit_Note/50116/'" w:xpath="/ns0:NavWordReportXmlPart[1]/ns0:Sales_Header[1]/ns0:Sales_Line[1]/ns0:Description[1]" w:storeItemID="{A0661616-9F8B-46E2-88DD-A8224F94B314}"/>
+                          <w:text/>
+                        </w:sdtPr>
+                        <w:sdtContent>
+                          <w:tc>
+                            <w:tcPr>
+                              <w:tcW w:w="4050" w:type="dxa"/>
+                              <w:shd w:val="clear" w:color="auto" w:fill="FFFFFF" w:themeFill="background1"/>
+                            </w:tcPr>
+                            <w:p>
+                              <w:pPr>
+                                <w:rPr>
+                                  <w:b/>
+                                  <w:bCs/>
+                                </w:rPr>
+                              </w:pPr>
+                              <w:r>
+                                <w:t>Description</w:t>
+                              </w:r>
+                            </w:p>
+                          </w:tc>
+                        </w:sdtContent>
+                      </w:sdt>
+                      <w:sdt>
+                        <w:sdtPr>
+                          <w:alias w:val="#Nav: /Sales_Header/Sales_Line/Line_Amount"/>
+                          <w:tag w:val="#Nav: Credit_Note/50116"/>
+                          <w:id w:val="1530069156"/>
+                          <w:placeholder>
+                            <w:docPart w:val="DefaultPlaceholder_-1854013440"/>
+                          </w:placeholder>
+                          <w:dataBinding w:prefixMappings="xmlns:ns0='urn:microsoft-dynamics-nav/reports/Credit_Note/50116/'" w:xpath="/ns0:NavWordReportXmlPart[1]/ns0:Sales_Header[1]/ns0:Sales_Line[1]/ns0:Line_Amount[1]" w:storeItemID="{A0661616-9F8B-46E2-88DD-A8224F94B314}"/>
+                          <w:text/>
+                        </w:sdtPr>
+                        <w:sdtContent>
+                          <w:tc>
+                            <w:tcPr>
+                              <w:tcW w:w="1559" w:type="dxa"/>
+                              <w:shd w:val="clear" w:color="auto" w:fill="FFFFFF" w:themeFill="background1"/>
+                            </w:tcPr>
+                            <w:p>
+                              <w:pPr>
+                                <w:jc w:val="right"/>
+                                <w:rPr>
+                                  <w:b/>
+                                  <w:bCs/>
+                                </w:rPr>
+                              </w:pPr>
+                              <w:proofErr w:type="spellStart"/>
+                              <w:r>
+                                <w:t>Line_Amount</w:t>
+                              </w:r>
+                              <w:proofErr w:type="spellEnd"/>
+                            </w:p>
+                          </w:tc>
+                        </w:sdtContent>
+                      </w:sdt>
+                      <w:sdt>
+                        <w:sdtPr>
+                          <w:alias w:val="#Nav: /Sales_Header/Sales_Line/VAT__"/>
+                          <w:tag w:val="#Nav: Credit_Note/50116"/>
+                          <w:id w:val="-1625232499"/>
+                          <w:placeholder>
+                            <w:docPart w:val="DefaultPlaceholder_-1854013440"/>
+                          </w:placeholder>
+                          <w:dataBinding w:prefixMappings="xmlns:ns0='urn:microsoft-dynamics-nav/reports/Credit_Note/50116/'" w:xpath="/ns0:NavWordReportXmlPart[1]/ns0:Sales_Header[1]/ns0:Sales_Line[1]/ns0:VAT__[1]" w:storeItemID="{A0661616-9F8B-46E2-88DD-A8224F94B314}"/>
+                          <w:text/>
+                        </w:sdtPr>
+                        <w:sdtContent>
+                          <w:tc>
+                            <w:tcPr>
+                              <w:tcW w:w="992" w:type="dxa"/>
+                              <w:shd w:val="clear" w:color="auto" w:fill="FFFFFF" w:themeFill="background1"/>
+                            </w:tcPr>
+                            <w:p>
+                              <w:pPr>
+                                <w:jc w:val="right"/>
+                                <w:rPr>
+                                  <w:b/>
+                                  <w:bCs/>
+                                </w:rPr>
+                              </w:pPr>
+                              <w:r>
+                                <w:t>VAT__</w:t>
+                              </w:r>
+                            </w:p>
+                          </w:tc>
+                        </w:sdtContent>
+                      </w:sdt>
+                      <w:sdt>
+                        <w:sdtPr>
+                          <w:alias w:val="#Nav: /Sales_Header/Sales_Line/VAT_Amount"/>
+                          <w:tag w:val="#Nav: Credit_Note/50116"/>
+                          <w:id w:val="-1498335999"/>
+                          <w:placeholder>
+                            <w:docPart w:val="DefaultPlaceholder_-1854013440"/>
+                          </w:placeholder>
+                          <w:dataBinding w:prefixMappings="xmlns:ns0='urn:microsoft-dynamics-nav/reports/Credit_Note/50116/'" w:xpath="/ns0:NavWordReportXmlPart[1]/ns0:Sales_Header[1]/ns0:Sales_Line[1]/ns0:VAT_Amount[1]" w:storeItemID="{A0661616-9F8B-46E2-88DD-A8224F94B314}"/>
+                          <w:text/>
+                        </w:sdtPr>
+                        <w:sdtContent>
+                          <w:tc>
+                            <w:tcPr>
+                              <w:tcW w:w="1418" w:type="dxa"/>
+                              <w:shd w:val="clear" w:color="auto" w:fill="FFFFFF" w:themeFill="background1"/>
+                            </w:tcPr>
+                            <w:p>
+                              <w:pPr>
+                                <w:jc w:val="right"/>
+                                <w:rPr>
+                                  <w:b/>
+                                  <w:bCs/>
+                                </w:rPr>
+                              </w:pPr>
+                              <w:proofErr w:type="spellStart"/>
+                              <w:r>
+                                <w:t>VAT_Amount</w:t>
+                              </w:r>
+                              <w:proofErr w:type="spellEnd"/>
+                            </w:p>
+                          </w:tc>
+                        </w:sdtContent>
+                      </w:sdt>
+                      <w:sdt>
+                        <w:sdtPr>
+                          <w:alias w:val="#Nav: /Sales_Header/Sales_Line/A_I_V"/>
+                          <w:tag w:val="#Nav: Credit_Note/50116"/>
+                          <w:id w:val="148259591"/>
+                          <w:placeholder>
+                            <w:docPart w:val="DefaultPlaceholder_-1854013440"/>
+                          </w:placeholder>
+                          <w:dataBinding w:prefixMappings="xmlns:ns0='urn:microsoft-dynamics-nav/reports/Credit_Note/50116/'" w:xpath="/ns0:NavWordReportXmlPart[1]/ns0:Sales_Header[1]/ns0:Sales_Line[1]/ns0:A_I_V[1]" w:storeItemID="{A0661616-9F8B-46E2-88DD-A8224F94B314}"/>
+                          <w:text/>
+                        </w:sdtPr>
+                        <w:sdtContent>
+                          <w:tc>
+                            <w:tcPr>
+                              <w:tcW w:w="1625" w:type="dxa"/>
+                              <w:shd w:val="clear" w:color="auto" w:fill="FFFFFF" w:themeFill="background1"/>
+                            </w:tcPr>
+                            <w:p>
+                              <w:pPr>
+                                <w:jc w:val="right"/>
+                                <w:rPr>
+                                  <w:b/>
+                                  <w:bCs/>
+                                </w:rPr>
+                              </w:pPr>
+                              <w:r>
+                                <w:t>A_I_V</w:t>
+                              </w:r>
+                            </w:p>
+                          </w:tc>
+                        </w:sdtContent>
+                      </w:sdt>
+                    </w:tr>
+                  </w:sdtContent>
+                </w:sdt>
+              </w:sdtContent>
+            </w:sdt>
             <w:tr>
               <w:trPr>
                 <w:trHeight w:val="244"/>
@@ -1173,6 +1464,13 @@
                       <w:bCs/>
                     </w:rPr>
                   </w:pPr>
+                  <w:r>
+                    <w:rPr>
+                      <w:b/>
+                      <w:bCs/>
+                    </w:rPr>
+                    <w:t>Total</w:t>
+                  </w:r>
                 </w:p>
               </w:tc>
               <w:tc>
@@ -1182,11 +1480,11 @@
                 </w:tcPr>
                 <w:p>
                   <w:pPr>
-                    <w:rPr>
-                      <w:b/>
-                      <w:bCs/>
-                    </w:rPr>
+                    <w:jc w:val="right"/>
                   </w:pPr>
+                  <w:r>
+                    <w:t>-</w:t>
+                  </w:r>
                 </w:p>
               </w:tc>
               <w:tc>
@@ -1196,11 +1494,11 @@
                 </w:tcPr>
                 <w:p>
                   <w:pPr>
-                    <w:rPr>
-                      <w:b/>
-                      <w:bCs/>
-                    </w:rPr>
+                    <w:jc w:val="right"/>
                   </w:pPr>
+                  <w:r>
+                    <w:t>-</w:t>
+                  </w:r>
                 </w:p>
               </w:tc>
               <w:tc>
@@ -1210,123 +1508,55 @@
                 </w:tcPr>
                 <w:p>
                   <w:pPr>
-                    <w:rPr>
-                      <w:b/>
-                      <w:bCs/>
-                    </w:rPr>
+                    <w:jc w:val="right"/>
                   </w:pPr>
-                </w:p>
-              </w:tc>
-              <w:tc>
-                <w:tcPr>
-                  <w:tcW w:w="1625" w:type="dxa"/>
-                  <w:shd w:val="clear" w:color="auto" w:fill="FFFFFF" w:themeFill="background1"/>
-                </w:tcPr>
-                <w:p>
-                  <w:pPr>
-                    <w:rPr>
-                      <w:b/>
-                      <w:bCs/>
-                    </w:rPr>
-                  </w:pPr>
-                </w:p>
-              </w:tc>
-            </w:tr>
-            <w:tr>
-              <w:trPr>
-                <w:trHeight w:val="244"/>
-              </w:trPr>
-              <w:tc>
-                <w:tcPr>
-                  <w:tcW w:w="1332" w:type="dxa"/>
-                  <w:shd w:val="clear" w:color="auto" w:fill="FFFFFF" w:themeFill="background1"/>
-                </w:tcPr>
-                <w:p>
-                  <w:pPr>
-                    <w:rPr>
-                      <w:b/>
-                      <w:bCs/>
-                    </w:rPr>
-                  </w:pPr>
-                </w:p>
-              </w:tc>
-              <w:tc>
-                <w:tcPr>
-                  <w:tcW w:w="4050" w:type="dxa"/>
-                  <w:shd w:val="clear" w:color="auto" w:fill="FFFFFF" w:themeFill="background1"/>
-                </w:tcPr>
-                <w:p>
-                  <w:pPr>
-                    <w:rPr>
-                      <w:b/>
-                      <w:bCs/>
-                    </w:rPr>
-                  </w:pPr>
-                  <w:r>
-                    <w:rPr>
-                      <w:b/>
-                      <w:bCs/>
-                    </w:rPr>
-                    <w:t>Total</w:t>
-                  </w:r>
-                </w:p>
-              </w:tc>
-              <w:tc>
-                <w:tcPr>
-                  <w:tcW w:w="1559" w:type="dxa"/>
-                  <w:shd w:val="clear" w:color="auto" w:fill="FFFFFF" w:themeFill="background1"/>
-                </w:tcPr>
-                <w:p>
-                  <w:pPr>
-                    <w:rPr>
-                      <w:b/>
-                      <w:bCs/>
-                    </w:rPr>
-                  </w:pPr>
-                </w:p>
-              </w:tc>
-              <w:tc>
-                <w:tcPr>
-                  <w:tcW w:w="992" w:type="dxa"/>
-                  <w:shd w:val="clear" w:color="auto" w:fill="FFFFFF" w:themeFill="background1"/>
-                </w:tcPr>
-                <w:p>
-                  <w:pPr>
-                    <w:rPr>
-                      <w:b/>
-                      <w:bCs/>
-                    </w:rPr>
-                  </w:pPr>
-                </w:p>
-              </w:tc>
-              <w:tc>
-                <w:tcPr>
-                  <w:tcW w:w="1418" w:type="dxa"/>
-                  <w:shd w:val="clear" w:color="auto" w:fill="FFFFFF" w:themeFill="background1"/>
-                </w:tcPr>
-                <w:p>
-                  <w:pPr>
-                    <w:rPr>
-                      <w:b/>
-                      <w:bCs/>
-                    </w:rPr>
-                  </w:pPr>
-                </w:p>
-              </w:tc>
-              <w:tc>
-                <w:tcPr>
-                  <w:tcW w:w="1625" w:type="dxa"/>
-                  <w:shd w:val="clear" w:color="auto" w:fill="FFFFFF" w:themeFill="background1"/>
-                </w:tcPr>
-                <w:p>
-                  <w:pPr>
-                    <w:rPr>
-                      <w:b/>
-                      <w:bCs/>
-                    </w:rPr>
-                  </w:pPr>
-                </w:p>
-              </w:tc>
+                  <w:r>
+                    <w:t>-</w:t>
+                  </w:r>
+                </w:p>
+              </w:tc>
+              <w:sdt>
+                <w:sdtPr>
+                  <w:rPr>
+                    <w:b/>
+                    <w:bCs/>
+                  </w:rPr>
+                  <w:alias w:val="#Nav: /Sales_Header/Totals/TAInclVAT"/>
+                  <w:tag w:val="#Nav: Credit_Note/50116"/>
+                  <w:id w:val="-1808237570"/>
+                  <w:placeholder>
+                    <w:docPart w:val="DefaultPlaceholder_-1854013440"/>
+                  </w:placeholder>
+                  <w:dataBinding w:prefixMappings="xmlns:ns0='urn:microsoft-dynamics-nav/reports/Credit_Note/50116/'" w:xpath="/ns0:NavWordReportXmlPart[1]/ns0:Sales_Header[1]/ns0:Totals[1]/ns0:TAInclVAT[1]" w:storeItemID="{A0661616-9F8B-46E2-88DD-A8224F94B314}"/>
+                  <w:text/>
+                </w:sdtPr>
+                <w:sdtContent>
+                  <w:tc>
+                    <w:tcPr>
+                      <w:tcW w:w="1625" w:type="dxa"/>
+                      <w:shd w:val="clear" w:color="auto" w:fill="FFFFFF" w:themeFill="background1"/>
+                    </w:tcPr>
+                    <w:p>
+                      <w:pPr>
+                        <w:jc w:val="right"/>
+                        <w:rPr>
+                          <w:b/>
+                          <w:bCs/>
+                        </w:rPr>
+                      </w:pPr>
+                      <w:proofErr w:type="spellStart"/>
+                      <w:r>
+                        <w:rPr>
+                          <w:b/>
+                          <w:bCs/>
+                        </w:rPr>
+                        <w:t>TAInclVAT</w:t>
+                      </w:r>
+                      <w:proofErr w:type="spellEnd"/>
+                    </w:p>
+                  </w:tc>
+                </w:sdtContent>
+              </w:sdt>
             </w:tr>
             <w:tr>
               <w:trPr>
@@ -1354,6 +1584,32 @@
                     </w:rPr>
                     <w:t>Total (In words)</w:t>
                   </w:r>
+                  <w:r>
+                    <w:rPr>
+                      <w:b/>
+                      <w:bCs/>
+                    </w:rPr>
+                    <w:br/>
+                  </w:r>
+                  <w:sdt>
+                    <w:sdtPr>
+                      <w:id w:val="-2109812461"/>
+                      <w:placeholder>
+                        <w:docPart w:val="DefaultPlaceholder_-1854013440"/>
+                      </w:placeholder>
+                      <w:dataBinding w:prefixMappings="xmlns:ns0='urn:microsoft-dynamics-nav/reports/Credit_Note/50116/'" w:xpath="/ns0:NavWordReportXmlPart[1]/ns0:Sales_Header[1]/ns0:Totals[1]/ns0:AmountInWords[1]" w:storeItemID="{A0661616-9F8B-46E2-88DD-A8224F94B314}"/>
+                      <w:text/>
+                      <w:alias w:val="#Nav: /Sales_Header/Totals/AmountInWords"/>
+                      <w:tag w:val="#Nav: Credit_Note/50116"/>
+                    </w:sdtPr>
+                    <w:sdtContent>
+                      <w:proofErr w:type="spellStart"/>
+                      <w:r>
+                        <w:t>AmountInWords</w:t>
+                      </w:r>
+                      <w:proofErr w:type="spellEnd"/>
+                    </w:sdtContent>
+                  </w:sdt>
                 </w:p>
               </w:tc>
             </w:tr>
@@ -1388,6 +1644,9 @@
                 <w:tcPr>
                   <w:tcW w:w="5382" w:type="dxa"/>
                   <w:gridSpan w:val="2"/>
+                  <w:tcBorders>
+                    <w:bottom w:val="nil"/>
+                  </w:tcBorders>
                 </w:tcPr>
                 <w:p>
                   <w:pPr>
@@ -1409,6 +1668,9 @@
                 <w:tcPr>
                   <w:tcW w:w="5594" w:type="dxa"/>
                   <w:gridSpan w:val="4"/>
+                  <w:tcBorders>
+                    <w:bottom w:val="nil"/>
+                  </w:tcBorders>
                 </w:tcPr>
                 <w:p>
                   <w:pPr>
@@ -1435,6 +1697,10 @@
                 <w:tcPr>
                   <w:tcW w:w="5382" w:type="dxa"/>
                   <w:gridSpan w:val="2"/>
+                  <w:tcBorders>
+                    <w:top w:val="nil"/>
+                    <w:bottom w:val="nil"/>
+                  </w:tcBorders>
                 </w:tcPr>
                 <w:p>
                   <w:r>
@@ -1442,14 +1708,14 @@
                   </w:r>
                   <w:sdt>
                     <w:sdtPr>
-                      <w:id w:val="-1333755915"/>
+                      <w:alias w:val="#Nav: /Sales_Header/CompanyName"/>
+                      <w:tag w:val="#Nav: Credit_Note/50116"/>
+                      <w:id w:val="-1043980981"/>
                       <w:placeholder>
                         <w:docPart w:val="DefaultPlaceholder_-1854013440"/>
                       </w:placeholder>
-                      <w:dataBinding w:prefixMappings="xmlns:ns0='urn:microsoft-dynamics-nav/reports/Credit_Note/50116/'" w:xpath="/ns0:NavWordReportXmlPart[1]/ns0:FinalCalculation[1]/ns0:CompanyName[1]" w:storeItemID="{A0661616-9F8B-46E2-88DD-A8224F94B314}"/>
+                      <w:dataBinding w:prefixMappings="xmlns:ns0='urn:microsoft-dynamics-nav/reports/Credit_Note/50116/'" w:xpath="/ns0:NavWordReportXmlPart[1]/ns0:Sales_Header[1]/ns0:CompanyName[1]" w:storeItemID="{A0661616-9F8B-46E2-88DD-A8224F94B314}"/>
                       <w:text/>
-                      <w:alias w:val="#Nav: /FinalCalculation/CompanyName"/>
-                      <w:tag w:val="#Nav: Credit_Note/50116"/>
                     </w:sdtPr>
                     <w:sdtContent>
                       <w:proofErr w:type="spellStart"/>
@@ -1465,6 +1731,10 @@
                 <w:tcPr>
                   <w:tcW w:w="5594" w:type="dxa"/>
                   <w:gridSpan w:val="4"/>
+                  <w:tcBorders>
+                    <w:top w:val="nil"/>
+                    <w:bottom w:val="nil"/>
+                  </w:tcBorders>
                 </w:tcPr>
                 <w:p>
                   <w:r>
@@ -1480,14 +1750,14 @@
                   </w:r>
                   <w:sdt>
                     <w:sdtPr>
-                      <w:id w:val="-787973923"/>
+                      <w:alias w:val="#Nav: /Sales_Header/BankAccountName"/>
+                      <w:tag w:val="#Nav: Credit_Note/50116"/>
+                      <w:id w:val="-1961105659"/>
                       <w:placeholder>
                         <w:docPart w:val="DefaultPlaceholder_-1854013440"/>
                       </w:placeholder>
-                      <w:dataBinding w:prefixMappings="xmlns:ns0='urn:microsoft-dynamics-nav/reports/Credit_Note/50116/'" w:xpath="/ns0:NavWordReportXmlPart[1]/ns0:FinalCalculation[1]/ns0:BankAccountName[1]" w:storeItemID="{A0661616-9F8B-46E2-88DD-A8224F94B314}"/>
+                      <w:dataBinding w:prefixMappings="xmlns:ns0='urn:microsoft-dynamics-nav/reports/Credit_Note/50116/'" w:xpath="/ns0:NavWordReportXmlPart[1]/ns0:Sales_Header[1]/ns0:BankAccountName[1]" w:storeItemID="{A0661616-9F8B-46E2-88DD-A8224F94B314}"/>
                       <w:text/>
-                      <w:alias w:val="#Nav: /FinalCalculation/BankAccountName"/>
-                      <w:tag w:val="#Nav: Credit_Note/50116"/>
                     </w:sdtPr>
                     <w:sdtContent>
                       <w:proofErr w:type="spellStart"/>
@@ -1508,6 +1778,10 @@
                 <w:tcPr>
                   <w:tcW w:w="5382" w:type="dxa"/>
                   <w:gridSpan w:val="2"/>
+                  <w:tcBorders>
+                    <w:top w:val="nil"/>
+                    <w:bottom w:val="nil"/>
+                  </w:tcBorders>
                 </w:tcPr>
                 <w:p>
                   <w:r>
@@ -1519,6 +1793,10 @@
                 <w:tcPr>
                   <w:tcW w:w="5594" w:type="dxa"/>
                   <w:gridSpan w:val="4"/>
+                  <w:tcBorders>
+                    <w:top w:val="nil"/>
+                    <w:bottom w:val="nil"/>
+                  </w:tcBorders>
                 </w:tcPr>
                 <w:p>
                   <w:r>
@@ -1534,14 +1812,14 @@
                   </w:r>
                   <w:sdt>
                     <w:sdtPr>
-                      <w:id w:val="1619560065"/>
+                      <w:alias w:val="#Nav: /Sales_Header/BankAccountNo"/>
+                      <w:tag w:val="#Nav: Credit_Note/50116"/>
+                      <w:id w:val="751470461"/>
                       <w:placeholder>
                         <w:docPart w:val="DefaultPlaceholder_-1854013440"/>
                       </w:placeholder>
-                      <w:dataBinding w:prefixMappings="xmlns:ns0='urn:microsoft-dynamics-nav/reports/Credit_Note/50116/'" w:xpath="/ns0:NavWordReportXmlPart[1]/ns0:FinalCalculation[1]/ns0:BankAccountNo[1]" w:storeItemID="{A0661616-9F8B-46E2-88DD-A8224F94B314}"/>
+                      <w:dataBinding w:prefixMappings="xmlns:ns0='urn:microsoft-dynamics-nav/reports/Credit_Note/50116/'" w:xpath="/ns0:NavWordReportXmlPart[1]/ns0:Sales_Header[1]/ns0:BankAccountNo[1]" w:storeItemID="{A0661616-9F8B-46E2-88DD-A8224F94B314}"/>
                       <w:text/>
-                      <w:alias w:val="#Nav: /FinalCalculation/BankAccountNo"/>
-                      <w:tag w:val="#Nav: Credit_Note/50116"/>
                     </w:sdtPr>
                     <w:sdtContent>
                       <w:proofErr w:type="spellStart"/>
@@ -1562,6 +1840,10 @@
                 <w:tcPr>
                   <w:tcW w:w="5382" w:type="dxa"/>
                   <w:gridSpan w:val="2"/>
+                  <w:tcBorders>
+                    <w:top w:val="nil"/>
+                    <w:bottom w:val="nil"/>
+                  </w:tcBorders>
                 </w:tcPr>
                 <w:p>
                   <w:pPr>
@@ -1576,6 +1858,10 @@
                 <w:tcPr>
                   <w:tcW w:w="5594" w:type="dxa"/>
                   <w:gridSpan w:val="4"/>
+                  <w:tcBorders>
+                    <w:top w:val="nil"/>
+                    <w:bottom w:val="nil"/>
+                  </w:tcBorders>
                 </w:tcPr>
                 <w:p>
                   <w:proofErr w:type="gramStart"/>
@@ -1588,14 +1874,14 @@
                   </w:r>
                   <w:sdt>
                     <w:sdtPr>
-                      <w:id w:val="205003170"/>
+                      <w:alias w:val="#Nav: /Sales_Header/BankIBAN"/>
+                      <w:tag w:val="#Nav: Credit_Note/50116"/>
+                      <w:id w:val="-2078889385"/>
                       <w:placeholder>
                         <w:docPart w:val="DefaultPlaceholder_-1854013440"/>
                       </w:placeholder>
-                      <w:dataBinding w:prefixMappings="xmlns:ns0='urn:microsoft-dynamics-nav/reports/Credit_Note/50116/'" w:xpath="/ns0:NavWordReportXmlPart[1]/ns0:FinalCalculation[1]/ns0:BankIBAN[1]" w:storeItemID="{A0661616-9F8B-46E2-88DD-A8224F94B314}"/>
+                      <w:dataBinding w:prefixMappings="xmlns:ns0='urn:microsoft-dynamics-nav/reports/Credit_Note/50116/'" w:xpath="/ns0:NavWordReportXmlPart[1]/ns0:Sales_Header[1]/ns0:BankIBAN[1]" w:storeItemID="{A0661616-9F8B-46E2-88DD-A8224F94B314}"/>
                       <w:text/>
-                      <w:alias w:val="#Nav: /FinalCalculation/BankIBAN"/>
-                      <w:tag w:val="#Nav: Credit_Note/50116"/>
                     </w:sdtPr>
                     <w:sdtContent>
                       <w:proofErr w:type="spellStart"/>
@@ -1616,6 +1902,10 @@
                 <w:tcPr>
                   <w:tcW w:w="5382" w:type="dxa"/>
                   <w:gridSpan w:val="2"/>
+                  <w:tcBorders>
+                    <w:top w:val="nil"/>
+                    <w:bottom w:val="nil"/>
+                  </w:tcBorders>
                 </w:tcPr>
                 <w:p>
                   <w:pPr>
@@ -1630,6 +1920,10 @@
                 <w:tcPr>
                   <w:tcW w:w="5594" w:type="dxa"/>
                   <w:gridSpan w:val="4"/>
+                  <w:tcBorders>
+                    <w:top w:val="nil"/>
+                    <w:bottom w:val="nil"/>
+                  </w:tcBorders>
                 </w:tcPr>
                 <w:p>
                   <w:r>
@@ -1645,14 +1939,14 @@
                   </w:r>
                   <w:sdt>
                     <w:sdtPr>
-                      <w:id w:val="1404183424"/>
+                      <w:alias w:val="#Nav: /Sales_Header/BankSwiftCode"/>
+                      <w:tag w:val="#Nav: Credit_Note/50116"/>
+                      <w:id w:val="331653456"/>
                       <w:placeholder>
                         <w:docPart w:val="DefaultPlaceholder_-1854013440"/>
                       </w:placeholder>
-                      <w:dataBinding w:prefixMappings="xmlns:ns0='urn:microsoft-dynamics-nav/reports/Credit_Note/50116/'" w:xpath="/ns0:NavWordReportXmlPart[1]/ns0:FinalCalculation[1]/ns0:BankSwiftCode[1]" w:storeItemID="{A0661616-9F8B-46E2-88DD-A8224F94B314}"/>
+                      <w:dataBinding w:prefixMappings="xmlns:ns0='urn:microsoft-dynamics-nav/reports/Credit_Note/50116/'" w:xpath="/ns0:NavWordReportXmlPart[1]/ns0:Sales_Header[1]/ns0:BankSwiftCode[1]" w:storeItemID="{A0661616-9F8B-46E2-88DD-A8224F94B314}"/>
                       <w:text/>
-                      <w:alias w:val="#Nav: /FinalCalculation/BankSwiftCode"/>
-                      <w:tag w:val="#Nav: Credit_Note/50116"/>
                     </w:sdtPr>
                     <w:sdtContent>
                       <w:proofErr w:type="spellStart"/>
@@ -1674,6 +1968,7 @@
                   <w:tcW w:w="5382" w:type="dxa"/>
                   <w:gridSpan w:val="2"/>
                   <w:tcBorders>
+                    <w:top w:val="nil"/>
                     <w:bottom w:val="single" w:color="auto" w:sz="4" w:space="0"/>
                   </w:tcBorders>
                 </w:tcPr>
@@ -1691,6 +1986,7 @@
                   <w:tcW w:w="5594" w:type="dxa"/>
                   <w:gridSpan w:val="4"/>
                   <w:tcBorders>
+                    <w:top w:val="nil"/>
                     <w:bottom w:val="single" w:color="auto" w:sz="4" w:space="0"/>
                   </w:tcBorders>
                 </w:tcPr>
@@ -1708,14 +2004,14 @@
                   </w:r>
                   <w:sdt>
                     <w:sdtPr>
-                      <w:id w:val="-2063700475"/>
+                      <w:alias w:val="#Nav: /Sales_Header/BankBranch"/>
+                      <w:tag w:val="#Nav: Credit_Note/50116"/>
+                      <w:id w:val="-44841095"/>
                       <w:placeholder>
                         <w:docPart w:val="DefaultPlaceholder_-1854013440"/>
                       </w:placeholder>
-                      <w:dataBinding w:prefixMappings="xmlns:ns0='urn:microsoft-dynamics-nav/reports/Credit_Note/50116/'" w:xpath="/ns0:NavWordReportXmlPart[1]/ns0:FinalCalculation[1]/ns0:BankBranch[1]" w:storeItemID="{A0661616-9F8B-46E2-88DD-A8224F94B314}"/>
+                      <w:dataBinding w:prefixMappings="xmlns:ns0='urn:microsoft-dynamics-nav/reports/Credit_Note/50116/'" w:xpath="/ns0:NavWordReportXmlPart[1]/ns0:Sales_Header[1]/ns0:BankBranch[1]" w:storeItemID="{A0661616-9F8B-46E2-88DD-A8224F94B314}"/>
                       <w:text/>
-                      <w:alias w:val="#Nav: /FinalCalculation/BankBranch"/>
-                      <w:tag w:val="#Nav: Credit_Note/50116"/>
                     </w:sdtPr>
                     <w:sdtContent>
                       <w:proofErr w:type="spellStart"/>
@@ -2378,122 +2674,6 @@
   <w:docParts>
     <w:docPart>
       <w:docPartPr>
-        <w:name w:val="3D84BFD8BD3E40DB9132ABE470E39955"/>
-        <w:category>
-          <w:name w:val="General"/>
-          <w:gallery w:val="placeholder"/>
-        </w:category>
-        <w:types>
-          <w:type w:val="bbPlcHdr"/>
-        </w:types>
-        <w:behaviors>
-          <w:behavior w:val="content"/>
-        </w:behaviors>
-        <w:guid w:val="{B51535EE-CF82-4F8B-B2D3-104F94A58604}"/>
-      </w:docPartPr>
-      <w:docPartBody>
-        <w:p>
-          <w:pPr>
-            <w:pStyle w:val="3D84BFD8BD3E40DB9132ABE470E39955"/>
-          </w:pPr>
-          <w:r>
-            <w:rPr>
-              <w:rStyle w:val="PlaceholderText"/>
-            </w:rPr>
-            <w:t>Click or tap here to enter text.</w:t>
-          </w:r>
-        </w:p>
-      </w:docPartBody>
-    </w:docPart>
-    <w:docPart>
-      <w:docPartPr>
-        <w:name w:val="6B47D3385FDA4A198E5FFC69BD6B40B6"/>
-        <w:category>
-          <w:name w:val="General"/>
-          <w:gallery w:val="placeholder"/>
-        </w:category>
-        <w:types>
-          <w:type w:val="bbPlcHdr"/>
-        </w:types>
-        <w:behaviors>
-          <w:behavior w:val="content"/>
-        </w:behaviors>
-        <w:guid w:val="{D3C8A3C8-6167-49D7-AE1B-4D70ABEEC344}"/>
-      </w:docPartPr>
-      <w:docPartBody>
-        <w:p>
-          <w:pPr>
-            <w:pStyle w:val="6B47D3385FDA4A198E5FFC69BD6B40B6"/>
-          </w:pPr>
-          <w:r>
-            <w:rPr>
-              <w:rStyle w:val="PlaceholderText"/>
-            </w:rPr>
-            <w:t>Click or tap here to enter text.</w:t>
-          </w:r>
-        </w:p>
-      </w:docPartBody>
-    </w:docPart>
-    <w:docPart>
-      <w:docPartPr>
-        <w:name w:val="4467748C899B427480A217B9D9897F67"/>
-        <w:category>
-          <w:name w:val="General"/>
-          <w:gallery w:val="placeholder"/>
-        </w:category>
-        <w:types>
-          <w:type w:val="bbPlcHdr"/>
-        </w:types>
-        <w:behaviors>
-          <w:behavior w:val="content"/>
-        </w:behaviors>
-        <w:guid w:val="{85C97AD5-9E7C-4DD1-8DBC-71F19EDA18A7}"/>
-      </w:docPartPr>
-      <w:docPartBody>
-        <w:p>
-          <w:pPr>
-            <w:pStyle w:val="4467748C899B427480A217B9D9897F67"/>
-          </w:pPr>
-          <w:r>
-            <w:rPr>
-              <w:rStyle w:val="PlaceholderText"/>
-            </w:rPr>
-            <w:t>Click or tap here to enter text.</w:t>
-          </w:r>
-        </w:p>
-      </w:docPartBody>
-    </w:docPart>
-    <w:docPart>
-      <w:docPartPr>
-        <w:name w:val="C75BEA1B10224BD0BF7231C0EBD4A45B"/>
-        <w:category>
-          <w:name w:val="General"/>
-          <w:gallery w:val="placeholder"/>
-        </w:category>
-        <w:types>
-          <w:type w:val="bbPlcHdr"/>
-        </w:types>
-        <w:behaviors>
-          <w:behavior w:val="content"/>
-        </w:behaviors>
-        <w:guid w:val="{DD5EBAFD-3946-45EF-A140-90EFBB69C6D3}"/>
-      </w:docPartPr>
-      <w:docPartBody>
-        <w:p>
-          <w:pPr>
-            <w:pStyle w:val="C75BEA1B10224BD0BF7231C0EBD4A45B"/>
-          </w:pPr>
-          <w:r>
-            <w:rPr>
-              <w:rStyle w:val="PlaceholderText"/>
-            </w:rPr>
-            <w:t>Click or tap here to enter text.</w:t>
-          </w:r>
-        </w:p>
-      </w:docPartBody>
-    </w:docPart>
-    <w:docPart>
-      <w:docPartPr>
         <w:name w:val="DefaultPlaceholder_-1854013440"/>
         <w:category>
           <w:name w:val="General"/>
@@ -2514,6 +2694,32 @@
               <w:rStyle w:val="PlaceholderText"/>
             </w:rPr>
             <w:t>Click or tap here to enter text.</w:t>
+          </w:r>
+        </w:p>
+      </w:docPartBody>
+    </w:docPart>
+    <w:docPart>
+      <w:docPartPr>
+        <w:name w:val="DefaultPlaceholder_-1854013435"/>
+        <w:category>
+          <w:name w:val="General"/>
+          <w:gallery w:val="placeholder"/>
+        </w:category>
+        <w:types>
+          <w:type w:val="bbPlcHdr"/>
+        </w:types>
+        <w:behaviors>
+          <w:behavior w:val="content"/>
+        </w:behaviors>
+        <w:guid w:val="{B487E599-A192-4191-A0AD-4F2E443E2BBF}"/>
+      </w:docPartPr>
+      <w:docPartBody>
+        <w:p>
+          <w:r>
+            <w:rPr>
+              <w:rStyle w:val="PlaceholderText"/>
+            </w:rPr>
+            <w:t>Enter any content that you want to repeat, including other content controls. You can also insert this control around table rows in order to repeat parts of a table.</w:t>
           </w:r>
         </w:p>
       </w:docPartBody>
@@ -2564,12 +2770,31 @@
   </w:compat>
   <w:rsids>
     <w:rsidRoot w:val="00F9341C"/>
+    <w:rsid w:val="00057152"/>
+    <w:rsid w:val="001A14C4"/>
+    <w:rsid w:val="00217D93"/>
+    <w:rsid w:val="00254E9A"/>
     <w:rsid w:val="002B33A6"/>
+    <w:rsid w:val="00376A85"/>
+    <w:rsid w:val="003F5DB7"/>
+    <w:rsid w:val="00412F17"/>
+    <w:rsid w:val="00452D4C"/>
+    <w:rsid w:val="00557594"/>
     <w:rsid w:val="005D4F9C"/>
+    <w:rsid w:val="006F4A4F"/>
+    <w:rsid w:val="008761AF"/>
+    <w:rsid w:val="00882FA4"/>
+    <w:rsid w:val="009620AC"/>
+    <w:rsid w:val="0098043E"/>
+    <w:rsid w:val="00B76D3C"/>
+    <w:rsid w:val="00B82531"/>
+    <w:rsid w:val="00C067CA"/>
     <w:rsid w:val="00C545EF"/>
     <w:rsid w:val="00C62FBE"/>
+    <w:rsid w:val="00CB2841"/>
     <w:rsid w:val="00D82F01"/>
     <w:rsid w:val="00F9341C"/>
+    <w:rsid w:val="00FA11CE"/>
   </w:rsids>
   <m:mathPr>
     <m:mathFont m:val="Cambria Math"/>
@@ -3025,26 +3250,10 @@
     <w:basedOn w:val="DefaultParagraphFont"/>
     <w:uiPriority w:val="99"/>
     <w:semiHidden/>
-    <w:rsid w:val="002B33A6"/>
+    <w:rsid w:val="00B82531"/>
     <w:rPr>
       <w:color w:val="666666"/>
     </w:rPr>
-  </w:style>
-  <w:style w:type="paragraph" w:customStyle="1" w:styleId="3D84BFD8BD3E40DB9132ABE470E39955">
-    <w:name w:val="3D84BFD8BD3E40DB9132ABE470E39955"/>
-    <w:rsid w:val="00F9341C"/>
-  </w:style>
-  <w:style w:type="paragraph" w:customStyle="1" w:styleId="6B47D3385FDA4A198E5FFC69BD6B40B6">
-    <w:name w:val="6B47D3385FDA4A198E5FFC69BD6B40B6"/>
-    <w:rsid w:val="00F9341C"/>
-  </w:style>
-  <w:style w:type="paragraph" w:customStyle="1" w:styleId="4467748C899B427480A217B9D9897F67">
-    <w:name w:val="4467748C899B427480A217B9D9897F67"/>
-    <w:rsid w:val="00F9341C"/>
-  </w:style>
-  <w:style w:type="paragraph" w:customStyle="1" w:styleId="C75BEA1B10224BD0BF7231C0EBD4A45B">
-    <w:name w:val="C75BEA1B10224BD0BF7231C0EBD4A45B"/>
-    <w:rsid w:val="00F9341C"/>
   </w:style>
 </w:styles>
 </file>
@@ -3353,7 +3562,9 @@
 
 <file path=customXml/item1.xml>��< ? x m l   v e r s i o n = " 1 . 0 "   e n c o d i n g = " u t f - 1 6 " ? > < N a v W o r d R e p o r t X m l P a r t   x m l n s = " u r n : m i c r o s o f t - d y n a m i c s - n a v / r e p o r t s / C r e d i t _ N o t e / 5 0 1 1 6 / " >   
-     < F i n a l C a l c u l a t i o n > +     < S a l e s _ H e a d e r > + 
+         < A p p l i e s _ t o _ D o c _ _ N o _ > A p p l i e s _ t o _ D o c _ _ N o _ < / A p p l i e s _ t o _ D o c _ _ N o _ >   
          < B a n k A c c o u n t N a m e > B a n k A c c o u n t N a m e < / B a n k A c c o u n t N a m e >   
@@ -3383,7 +3594,65 @@
  
          < C o m p a n y T R N > C o m p a n y T R N < / C o m p a n y T R N >   
-     < / F i n a l C a l c u l a t i o n > +         < C o n t r a c t _ I D > C o n t r a c t _ I D < / C o n t r a c t _ I D > + 
+         < C u r r e n t D a t e > C u r r e n t D a t e < / C u r r e n t D a t e > + 
+         < N o _ > N o _ < / N o _ > + 
+         < S a l e s _ L i n e > + 
+             < A _ I _ V > A _ I _ V < / A _ I _ V > + 
+             < D e s c r i p t i o n > D e s c r i p t i o n < / D e s c r i p t i o n > + 
+             < L i n e _ A m o u n t > L i n e _ A m o u n t < / L i n e _ A m o u n t > + 
+             < S e r i a l _ N o > S e r i a l _ N o < / S e r i a l _ N o > + 
+             < V A T _ A m o u n t > V A T _ A m o u n t < / V A T _ A m o u n t > + 
+             < V A T _ _ > V A T _ _ < / V A T _ _ > + 
+         < / S a l e s _ L i n e > + 
+         < T o t a l s > + 
+             < A m o u n t I n W o r d s > A m o u n t I n W o r d s < / A m o u n t I n W o r d s > + 
+             < T A I n c l V A T > T A I n c l V A T < / T A I n c l V A T > + 
+         < / T o t a l s > + 
+         < T e n a n c y _ C o n t r a c t > + 
+             < C o n t r a c t _ E n d _ D a t e > C o n t r a c t _ E n d _ D a t e < / C o n t r a c t _ E n d _ D a t e > + 
+             < C o n t r a c t _ S t a r t _ D a t e > C o n t r a c t _ S t a r t _ D a t e < / C o n t r a c t _ S t a r t _ D a t e > + 
+             < C o n t r a c t _ T e n o r > C o n t r a c t _ T e n o r < / C o n t r a c t _ T e n o r > + 
+             < P r o p e r t y _ N a m e > P r o p e r t y _ N a m e < / P r o p e r t y _ N a m e > + 
+             < u n i t _ N a m e > u n i t _ N a m e < / u n i t _ N a m e > + 
+         < / T e n a n c y _ C o n t r a c t > + 
+         < C u s t o m e r > + 
+             < A d d r e s s > A d d r e s s < / A d d r e s s > + 
+             < C u s _ T R N > C u s _ T R N < / C u s _ T R N > + 
+             < E _ M a i l > E _ M a i l < / E _ M a i l > + 
+             < N a m e > N a m e < / N a m e > + 
+             < P h o n e _ N o _ > P h o n e _ N o _ < / P h o n e _ N o _ > + 
+         < / C u s t o m e r > + 
+     < / S a l e s _ H e a d e r >   
  < / N a v W o r d R e p o r t X m l P a r t > 
 </file>

</xml_diff>